<commit_message>
feat: Add Custom Requirement Auditor and Precision Source Coordinate Anchoring (45 tests 100% pass)
</commit_message>
<xml_diff>
--- a/secure_local_data/TBM_안전점검표_20260829.docx
+++ b/secure_local_data/TBM_안전점검표_20260829.docx
@@ -403,7 +403,7 @@
           <w:rFonts w:ascii="맑은 고딕" w:hAnsi="맑은 고딕"/>
           <w:sz w:val="19"/>
         </w:rPr>
-        <w:t xml:space="preserve"> 지하 토사 굴착, 가설 비계 설치, 크레인 양중, 철골 용접</w:t>
+        <w:t xml:space="preserve"> 지하 10m 토사 굴착, 가설 비계 설치 및 해체, 50톤 크레인 양중 작업</w:t>
       </w:r>
     </w:p>
     <w:p>
@@ -429,7 +429,7 @@
           <w:rFonts w:ascii="맑은 고딕" w:hAnsi="맑은 고딕"/>
           <w:sz w:val="19"/>
         </w:rPr>
-        <w:t xml:space="preserve"> 6건 도출</w:t>
+        <w:t xml:space="preserve"> 5건 도출</w:t>
       </w:r>
     </w:p>
     <w:p>
@@ -612,7 +612,7 @@
                 <w:rFonts w:ascii="맑은 고딕" w:hAnsi="맑은 고딕"/>
                 <w:sz w:val="18"/>
               </w:rPr>
-              <w:t>지하 토사 굴착</w:t>
+              <w:t>지하 10m 토사 굴착</w:t>
             </w:r>
           </w:p>
         </w:tc>
@@ -733,7 +733,7 @@
                 <w:rFonts w:ascii="맑은 고딕" w:hAnsi="맑은 고딕"/>
                 <w:sz w:val="18"/>
               </w:rPr>
-              <w:t>지하 토사 굴착</w:t>
+              <w:t>지하 10m 토사 굴착</w:t>
             </w:r>
           </w:p>
         </w:tc>
@@ -851,7 +851,7 @@
                 <w:rFonts w:ascii="맑은 고딕" w:hAnsi="맑은 고딕"/>
                 <w:sz w:val="18"/>
               </w:rPr>
-              <w:t>가설 비계 설치</w:t>
+              <w:t>가설 비계 설치 및 해체</w:t>
             </w:r>
           </w:p>
         </w:tc>
@@ -972,7 +972,7 @@
                 <w:rFonts w:ascii="맑은 고딕" w:hAnsi="맑은 고딕"/>
                 <w:sz w:val="18"/>
               </w:rPr>
-              <w:t>가설 비계 설치</w:t>
+              <w:t>가설 비계 설치 및 해체</w:t>
             </w:r>
           </w:p>
         </w:tc>
@@ -1090,7 +1090,7 @@
                 <w:rFonts w:ascii="맑은 고딕" w:hAnsi="맑은 고딕"/>
                 <w:sz w:val="18"/>
               </w:rPr>
-              <w:t>크레인 양중</w:t>
+              <w:t>50톤 크레인 양중 작업</w:t>
             </w:r>
           </w:p>
         </w:tc>
@@ -1211,7 +1211,7 @@
                 <w:rFonts w:ascii="맑은 고딕" w:hAnsi="맑은 고딕"/>
                 <w:sz w:val="18"/>
               </w:rPr>
-              <w:t>크레인 양중</w:t>
+              <w:t>50톤 크레인 양중 작업</w:t>
             </w:r>
           </w:p>
         </w:tc>
@@ -1304,245 +1304,6 @@
                 <w:sz w:val="18"/>
               </w:rPr>
               <w:t>아웃트리거 수평계 확인 및 연약지반 치환 상태</w:t>
-            </w:r>
-          </w:p>
-        </w:tc>
-      </w:tr>
-      <w:tr>
-        <w:tc>
-          <w:tcPr>
-            <w:tcW w:type="dxa" w:w="1987"/>
-            <w:tcMar>
-              <w:top w:w="100" w:type="dxa"/>
-              <w:bottom w:w="100" w:type="dxa"/>
-              <w:left w:w="120" w:type="dxa"/>
-              <w:right w:w="120" w:type="dxa"/>
-            </w:tcMar>
-            <w:shd w:fill="F7FAFC"/>
-          </w:tcPr>
-          <w:p>
-            <w:pPr>
-              <w:jc w:val="left"/>
-            </w:pPr>
-            <w:r>
-              <w:rPr>
-                <w:rFonts w:ascii="맑은 고딕" w:hAnsi="맑은 고딕"/>
-                <w:sz w:val="18"/>
-              </w:rPr>
-              <w:t>철골 용접</w:t>
-            </w:r>
-          </w:p>
-        </w:tc>
-        <w:tc>
-          <w:tcPr>
-            <w:tcW w:type="dxa" w:w="1987"/>
-            <w:tcMar>
-              <w:top w:w="100" w:type="dxa"/>
-              <w:bottom w:w="100" w:type="dxa"/>
-              <w:left w:w="120" w:type="dxa"/>
-              <w:right w:w="120" w:type="dxa"/>
-            </w:tcMar>
-            <w:shd w:fill="F7FAFC"/>
-          </w:tcPr>
-          <w:p>
-            <w:pPr>
-              <w:jc w:val="left"/>
-            </w:pPr>
-            <w:r>
-              <w:rPr>
-                <w:rFonts w:ascii="맑은 고딕" w:hAnsi="맑은 고딕"/>
-                <w:sz w:val="18"/>
-              </w:rPr>
-              <w:t>용접 불티 비산에 의한 화재 및 가연물 폭발</w:t>
-            </w:r>
-          </w:p>
-        </w:tc>
-        <w:tc>
-          <w:tcPr>
-            <w:tcW w:type="dxa" w:w="1987"/>
-            <w:tcMar>
-              <w:top w:w="100" w:type="dxa"/>
-              <w:bottom w:w="100" w:type="dxa"/>
-              <w:left w:w="120" w:type="dxa"/>
-              <w:right w:w="120" w:type="dxa"/>
-            </w:tcMar>
-            <w:shd w:fill="F7FAFC"/>
-          </w:tcPr>
-          <w:p>
-            <w:pPr>
-              <w:jc w:val="left"/>
-            </w:pPr>
-            <w:r>
-              <w:rPr>
-                <w:rFonts w:ascii="맑은 고딕" w:hAnsi="맑은 고딕"/>
-                <w:sz w:val="18"/>
-              </w:rPr>
-              <w:t>**상 (HIGH)**</w:t>
-            </w:r>
-          </w:p>
-        </w:tc>
-        <w:tc>
-          <w:tcPr>
-            <w:tcW w:type="dxa" w:w="1987"/>
-            <w:tcMar>
-              <w:top w:w="100" w:type="dxa"/>
-              <w:bottom w:w="100" w:type="dxa"/>
-              <w:left w:w="120" w:type="dxa"/>
-              <w:right w:w="120" w:type="dxa"/>
-            </w:tcMar>
-            <w:shd w:fill="F7FAFC"/>
-          </w:tcPr>
-          <w:p>
-            <w:pPr>
-              <w:jc w:val="left"/>
-            </w:pPr>
-            <w:r>
-              <w:rPr>
-                <w:rFonts w:ascii="맑은 고딕" w:hAnsi="맑은 고딕"/>
-                <w:sz w:val="18"/>
-              </w:rPr>
-              <w:t>작업 반경 11m 이내 가연물 제거, 불티 비산방지포 설치, 소화기 2대 전면 비치</w:t>
-            </w:r>
-          </w:p>
-        </w:tc>
-        <w:tc>
-          <w:tcPr>
-            <w:tcW w:type="dxa" w:w="1987"/>
-            <w:tcMar>
-              <w:top w:w="100" w:type="dxa"/>
-              <w:bottom w:w="100" w:type="dxa"/>
-              <w:left w:w="120" w:type="dxa"/>
-              <w:right w:w="120" w:type="dxa"/>
-            </w:tcMar>
-            <w:shd w:fill="F7FAFC"/>
-          </w:tcPr>
-          <w:p>
-            <w:pPr>
-              <w:jc w:val="left"/>
-            </w:pPr>
-            <w:r>
-              <w:rPr>
-                <w:rFonts w:ascii="맑은 고딕" w:hAnsi="맑은 고딕"/>
-                <w:sz w:val="18"/>
-              </w:rPr>
-              <w:t>전담 화재감시자 배치 및 화기작업허가서 승인 확인</w:t>
-            </w:r>
-          </w:p>
-        </w:tc>
-      </w:tr>
-      <w:tr>
-        <w:tc>
-          <w:tcPr>
-            <w:tcW w:type="dxa" w:w="1987"/>
-            <w:tcMar>
-              <w:top w:w="100" w:type="dxa"/>
-              <w:bottom w:w="100" w:type="dxa"/>
-              <w:left w:w="120" w:type="dxa"/>
-              <w:right w:w="120" w:type="dxa"/>
-            </w:tcMar>
-          </w:tcPr>
-          <w:p>
-            <w:pPr>
-              <w:jc w:val="left"/>
-            </w:pPr>
-            <w:r>
-              <w:rPr>
-                <w:rFonts w:ascii="맑은 고딕" w:hAnsi="맑은 고딕"/>
-                <w:sz w:val="18"/>
-              </w:rPr>
-              <w:t>철골 용접</w:t>
-            </w:r>
-          </w:p>
-        </w:tc>
-        <w:tc>
-          <w:tcPr>
-            <w:tcW w:type="dxa" w:w="1987"/>
-            <w:tcMar>
-              <w:top w:w="100" w:type="dxa"/>
-              <w:bottom w:w="100" w:type="dxa"/>
-              <w:left w:w="120" w:type="dxa"/>
-              <w:right w:w="120" w:type="dxa"/>
-            </w:tcMar>
-          </w:tcPr>
-          <w:p>
-            <w:pPr>
-              <w:jc w:val="left"/>
-            </w:pPr>
-            <w:r>
-              <w:rPr>
-                <w:rFonts w:ascii="맑은 고딕" w:hAnsi="맑은 고딕"/>
-                <w:sz w:val="18"/>
-              </w:rPr>
-              <w:t>용접봉 접촉에 의한 감전 및 유해가스 흡입</w:t>
-            </w:r>
-          </w:p>
-        </w:tc>
-        <w:tc>
-          <w:tcPr>
-            <w:tcW w:type="dxa" w:w="1987"/>
-            <w:tcMar>
-              <w:top w:w="100" w:type="dxa"/>
-              <w:bottom w:w="100" w:type="dxa"/>
-              <w:left w:w="120" w:type="dxa"/>
-              <w:right w:w="120" w:type="dxa"/>
-            </w:tcMar>
-          </w:tcPr>
-          <w:p>
-            <w:pPr>
-              <w:jc w:val="left"/>
-            </w:pPr>
-            <w:r>
-              <w:rPr>
-                <w:rFonts w:ascii="맑은 고딕" w:hAnsi="맑은 고딕"/>
-                <w:sz w:val="18"/>
-              </w:rPr>
-              <w:t>**중 (MEDIUM)**</w:t>
-            </w:r>
-          </w:p>
-        </w:tc>
-        <w:tc>
-          <w:tcPr>
-            <w:tcW w:type="dxa" w:w="1987"/>
-            <w:tcMar>
-              <w:top w:w="100" w:type="dxa"/>
-              <w:bottom w:w="100" w:type="dxa"/>
-              <w:left w:w="120" w:type="dxa"/>
-              <w:right w:w="120" w:type="dxa"/>
-            </w:tcMar>
-          </w:tcPr>
-          <w:p>
-            <w:pPr>
-              <w:jc w:val="left"/>
-            </w:pPr>
-            <w:r>
-              <w:rPr>
-                <w:rFonts w:ascii="맑은 고딕" w:hAnsi="맑은 고딕"/>
-                <w:sz w:val="18"/>
-              </w:rPr>
-              <w:t>자동전격방지기 작동 확인, 절연장갑/방진마스크 착용, 환기팬 가동</w:t>
-            </w:r>
-          </w:p>
-        </w:tc>
-        <w:tc>
-          <w:tcPr>
-            <w:tcW w:type="dxa" w:w="1987"/>
-            <w:tcMar>
-              <w:top w:w="100" w:type="dxa"/>
-              <w:bottom w:w="100" w:type="dxa"/>
-              <w:left w:w="120" w:type="dxa"/>
-              <w:right w:w="120" w:type="dxa"/>
-            </w:tcMar>
-          </w:tcPr>
-          <w:p>
-            <w:pPr>
-              <w:jc w:val="left"/>
-            </w:pPr>
-            <w:r>
-              <w:rPr>
-                <w:rFonts w:ascii="맑은 고딕" w:hAnsi="맑은 고딕"/>
-                <w:sz w:val="18"/>
-              </w:rPr>
-              <w:t>전격방지기 램프 정상 점등 및 케이블 피복 손상 여부</w:t>
             </w:r>
           </w:p>
         </w:tc>

</xml_diff>